<commit_message>
Correcciones de los documentos de las practicas adecuados al uso de los códigos
</commit_message>
<xml_diff>
--- a/Practicas/Practica 6/Practica6_Expediente.docx
+++ b/Practicas/Practica 6/Practica6_Expediente.docx
@@ -751,444 +751,150 @@
     </w:p>
     <w:p>
       <w:pPr>
+        <w:pStyle w:val="Codigo"/>
+      </w:pPr>
+      <w:r>
+        <w:t>{</w:t>
+      </w:r>
+    </w:p>
+    <w:p>
+      <w:pPr>
+        <w:pStyle w:val="Codigo"/>
+      </w:pPr>
+      <w:r>
+        <w:t xml:space="preserve">  "id": "",</w:t>
+      </w:r>
+    </w:p>
+    <w:p>
+      <w:pPr>
+        <w:pStyle w:val="Codigo"/>
+      </w:pPr>
+      <w:r>
+        <w:t xml:space="preserve">  "claveExpediente": "string", </w:t>
+      </w:r>
+      <w:r>
+        <w:sym w:font="Wingdings" w:char="F0E0"/>
+      </w:r>
+      <w:r>
+        <w:t xml:space="preserve"> Ej: EXP-010 </w:t>
+      </w:r>
+    </w:p>
+    <w:p>
+      <w:pPr>
+        <w:pStyle w:val="Codigo"/>
+      </w:pPr>
+      <w:r>
+        <w:t xml:space="preserve">  "ordenFabricacion": "string", </w:t>
+      </w:r>
+      <w:r>
+        <w:sym w:font="Wingdings" w:char="F0E0"/>
+      </w:r>
+      <w:r>
+        <w:t xml:space="preserve"> ingrese el Id de una orden de fabricacion</w:t>
+      </w:r>
+    </w:p>
+    <w:p>
+      <w:pPr>
+        <w:pStyle w:val="Codigo"/>
+      </w:pPr>
+      <w:r>
+        <w:lastRenderedPageBreak/>
+        <w:t xml:space="preserve">  "cantidadMuestras": </w:t>
+      </w:r>
+      <w:r>
+        <w:t>0</w:t>
+      </w:r>
+      <w:r>
+        <w:t>,</w:t>
+      </w:r>
+      <w:r>
+        <w:t xml:space="preserve"> </w:t>
+      </w:r>
+      <w:r>
+        <w:sym w:font="Wingdings" w:char="F0E0"/>
+      </w:r>
+      <w:r>
+        <w:t xml:space="preserve"> Ej: 10</w:t>
+      </w:r>
+    </w:p>
+    <w:p>
+      <w:pPr>
+        <w:pStyle w:val="Codigo"/>
+      </w:pPr>
+      <w:r>
+        <w:t xml:space="preserve">  "maximoRechazos": 0,</w:t>
+      </w:r>
+    </w:p>
+    <w:p>
+      <w:pPr>
+        <w:pStyle w:val="Codigo"/>
+      </w:pPr>
+      <w:r>
+        <w:t xml:space="preserve">  "muestras": [</w:t>
+      </w:r>
+    </w:p>
+    <w:p>
+      <w:pPr>
+        <w:pStyle w:val="Codigo"/>
+      </w:pPr>
+      <w:r>
+        <w:t xml:space="preserve">    "strin</w:t>
+      </w:r>
+      <w:r>
+        <w:t>g</w:t>
+      </w:r>
+      <w:r>
+        <w:t>"</w:t>
+      </w:r>
+      <w:r>
+        <w:t xml:space="preserve"> </w:t>
+      </w:r>
+      <w:r>
+        <w:sym w:font="Wingdings" w:char="F0E0"/>
+      </w:r>
+      <w:r>
+        <w:t xml:space="preserve"> Ej: M02</w:t>
+      </w:r>
+    </w:p>
+    <w:p>
+      <w:pPr>
+        <w:pStyle w:val="Codigo"/>
+      </w:pPr>
+      <w:r>
+        <w:t xml:space="preserve">  ]</w:t>
+      </w:r>
+    </w:p>
+    <w:p>
+      <w:pPr>
+        <w:pStyle w:val="Codigo"/>
+        <w:rPr>
+          <w:color w:val="002060"/>
+        </w:rPr>
+      </w:pPr>
+      <w:r>
+        <w:t>}</w:t>
+      </w:r>
+      <w:r>
+        <w:br/>
+      </w:r>
+    </w:p>
+    <w:p>
+      <w:pPr>
         <w:spacing w:line="276" w:lineRule="auto"/>
         <w:ind w:left="720"/>
         <w:rPr>
-          <w:lang w:val="en-US"/>
-        </w:rPr>
-      </w:pPr>
-      <w:r>
-        <w:rPr>
-          <w:lang w:val="en-US"/>
-        </w:rPr>
-        <w:t>{</w:t>
-      </w:r>
+          <w:color w:val="002060"/>
+        </w:rPr>
+      </w:pPr>
     </w:p>
     <w:p>
       <w:pPr>
         <w:spacing w:line="276" w:lineRule="auto"/>
         <w:ind w:left="720"/>
-      </w:pPr>
-      <w:r>
-        <w:t xml:space="preserve">  </w:t>
-      </w:r>
-      <w:r>
-        <w:rPr>
-          <w:color w:val="C00000"/>
-        </w:rPr>
-        <w:t>"id"</w:t>
-      </w:r>
-      <w:r>
         <w:rPr>
           <w:color w:val="002060"/>
         </w:rPr>
-        <w:t>: "",</w:t>
-      </w:r>
-    </w:p>
-    <w:p>
-      <w:pPr>
-        <w:spacing w:line="276" w:lineRule="auto"/>
-        <w:ind w:left="720"/>
-      </w:pPr>
-      <w:r>
-        <w:t xml:space="preserve">  </w:t>
-      </w:r>
-      <w:r>
-        <w:rPr>
-          <w:color w:val="C00000"/>
-        </w:rPr>
-        <w:t>"</w:t>
-      </w:r>
-      <w:proofErr w:type="spellStart"/>
-      <w:r>
-        <w:rPr>
-          <w:color w:val="C00000"/>
-        </w:rPr>
-        <w:t>claveExpediente</w:t>
-      </w:r>
-      <w:proofErr w:type="spellEnd"/>
-      <w:r>
-        <w:rPr>
-          <w:color w:val="C00000"/>
-        </w:rPr>
-        <w:t>"</w:t>
-      </w:r>
-      <w:r>
-        <w:rPr>
-          <w:color w:val="002060"/>
-        </w:rPr>
-        <w:t>: "</w:t>
-      </w:r>
-      <w:proofErr w:type="spellStart"/>
-      <w:r>
-        <w:rPr>
-          <w:color w:val="002060"/>
-        </w:rPr>
-        <w:t>string</w:t>
-      </w:r>
-      <w:proofErr w:type="spellEnd"/>
-      <w:r>
-        <w:rPr>
-          <w:color w:val="002060"/>
-        </w:rPr>
-        <w:t>",</w:t>
-      </w:r>
-      <w:r>
-        <w:rPr>
-          <w:color w:val="002060"/>
-        </w:rPr>
-        <w:t xml:space="preserve"> </w:t>
-      </w:r>
-      <w:r>
-        <w:rPr>
-          <w:color w:val="002060"/>
-          <w:lang w:val="en-US"/>
-        </w:rPr>
-        <w:sym w:font="Wingdings" w:char="F0E0"/>
-      </w:r>
-      <w:r>
-        <w:rPr>
-          <w:color w:val="002060"/>
-        </w:rPr>
-        <w:t xml:space="preserve"> </w:t>
-      </w:r>
-      <w:proofErr w:type="spellStart"/>
-      <w:r>
-        <w:rPr>
-          <w:color w:val="002060"/>
-        </w:rPr>
-        <w:t>Ej</w:t>
-      </w:r>
-      <w:proofErr w:type="spellEnd"/>
-      <w:r>
-        <w:rPr>
-          <w:color w:val="002060"/>
-        </w:rPr>
-        <w:t xml:space="preserve">: EXP-010 </w:t>
-      </w:r>
-    </w:p>
-    <w:p>
-      <w:pPr>
-        <w:spacing w:line="276" w:lineRule="auto"/>
-        <w:ind w:left="720"/>
-      </w:pPr>
-      <w:r>
-        <w:t xml:space="preserve">  </w:t>
-      </w:r>
-      <w:r>
-        <w:rPr>
-          <w:color w:val="C00000"/>
-        </w:rPr>
-        <w:t>"</w:t>
-      </w:r>
-      <w:proofErr w:type="spellStart"/>
-      <w:r>
-        <w:rPr>
-          <w:color w:val="C00000"/>
-        </w:rPr>
-        <w:t>ordenFabricacion</w:t>
-      </w:r>
-      <w:proofErr w:type="spellEnd"/>
-      <w:r>
-        <w:rPr>
-          <w:color w:val="C00000"/>
-        </w:rPr>
-        <w:t>"</w:t>
-      </w:r>
-      <w:r>
-        <w:rPr>
-          <w:color w:val="002060"/>
-        </w:rPr>
-        <w:t>: "</w:t>
-      </w:r>
-      <w:proofErr w:type="spellStart"/>
-      <w:r>
-        <w:rPr>
-          <w:color w:val="002060"/>
-        </w:rPr>
-        <w:t>string</w:t>
-      </w:r>
-      <w:proofErr w:type="spellEnd"/>
-      <w:r>
-        <w:rPr>
-          <w:color w:val="002060"/>
-        </w:rPr>
-        <w:t>",</w:t>
-      </w:r>
-      <w:r>
-        <w:rPr>
-          <w:color w:val="002060"/>
-        </w:rPr>
-        <w:t xml:space="preserve"> </w:t>
-      </w:r>
-      <w:r>
-        <w:rPr>
-          <w:color w:val="002060"/>
-        </w:rPr>
-        <w:sym w:font="Wingdings" w:char="F0E0"/>
-      </w:r>
-      <w:r>
-        <w:rPr>
-          <w:color w:val="002060"/>
-        </w:rPr>
-        <w:t xml:space="preserve"> ingrese el Id de una orden de </w:t>
-      </w:r>
-      <w:proofErr w:type="spellStart"/>
-      <w:r>
-        <w:rPr>
-          <w:color w:val="002060"/>
-        </w:rPr>
-        <w:t>fabricacion</w:t>
-      </w:r>
-      <w:proofErr w:type="spellEnd"/>
-    </w:p>
-    <w:p>
-      <w:pPr>
-        <w:spacing w:line="276" w:lineRule="auto"/>
-        <w:ind w:left="720"/>
-      </w:pPr>
-      <w:r>
-        <w:lastRenderedPageBreak/>
-        <w:t xml:space="preserve">  </w:t>
-      </w:r>
-      <w:r>
-        <w:rPr>
-          <w:color w:val="C00000"/>
-        </w:rPr>
-        <w:t>"</w:t>
-      </w:r>
-      <w:proofErr w:type="spellStart"/>
-      <w:r>
-        <w:rPr>
-          <w:color w:val="C00000"/>
-        </w:rPr>
-        <w:t>cantidadMuestras</w:t>
-      </w:r>
-      <w:proofErr w:type="spellEnd"/>
-      <w:r>
-        <w:rPr>
-          <w:color w:val="C00000"/>
-        </w:rPr>
-        <w:t>"</w:t>
-      </w:r>
-      <w:r>
-        <w:rPr>
-          <w:color w:val="002060"/>
-        </w:rPr>
-        <w:t xml:space="preserve">: </w:t>
-      </w:r>
-      <w:r>
-        <w:rPr>
-          <w:color w:val="002060"/>
-        </w:rPr>
-        <w:t>0</w:t>
-      </w:r>
-      <w:r>
-        <w:rPr>
-          <w:color w:val="002060"/>
-        </w:rPr>
-        <w:t>,</w:t>
-      </w:r>
-      <w:r>
-        <w:rPr>
-          <w:color w:val="002060"/>
-        </w:rPr>
-        <w:t xml:space="preserve"> </w:t>
-      </w:r>
-      <w:r>
-        <w:rPr>
-          <w:color w:val="002060"/>
-        </w:rPr>
-        <w:sym w:font="Wingdings" w:char="F0E0"/>
-      </w:r>
-      <w:r>
-        <w:rPr>
-          <w:color w:val="002060"/>
-        </w:rPr>
-        <w:t xml:space="preserve"> </w:t>
-      </w:r>
-      <w:proofErr w:type="spellStart"/>
-      <w:r>
-        <w:rPr>
-          <w:color w:val="002060"/>
-        </w:rPr>
-        <w:t>Ej</w:t>
-      </w:r>
-      <w:proofErr w:type="spellEnd"/>
-      <w:r>
-        <w:rPr>
-          <w:color w:val="002060"/>
-        </w:rPr>
-        <w:t>: 10</w:t>
-      </w:r>
-    </w:p>
-    <w:p>
-      <w:pPr>
-        <w:spacing w:line="276" w:lineRule="auto"/>
-        <w:ind w:left="720"/>
-      </w:pPr>
-      <w:r>
-        <w:t xml:space="preserve">  </w:t>
-      </w:r>
-      <w:r>
-        <w:rPr>
-          <w:color w:val="C00000"/>
-        </w:rPr>
-        <w:t>"</w:t>
-      </w:r>
-      <w:proofErr w:type="spellStart"/>
-      <w:r>
-        <w:rPr>
-          <w:color w:val="C00000"/>
-        </w:rPr>
-        <w:t>maximoRechazos</w:t>
-      </w:r>
-      <w:proofErr w:type="spellEnd"/>
-      <w:r>
-        <w:rPr>
-          <w:color w:val="C00000"/>
-        </w:rPr>
-        <w:t>"</w:t>
-      </w:r>
-      <w:r>
-        <w:rPr>
-          <w:color w:val="002060"/>
-        </w:rPr>
-        <w:t>: 0,</w:t>
-      </w:r>
-    </w:p>
-    <w:p>
-      <w:pPr>
-        <w:spacing w:line="276" w:lineRule="auto"/>
-        <w:ind w:left="720"/>
-        <w:rPr>
-          <w:color w:val="002060"/>
-        </w:rPr>
-      </w:pPr>
-      <w:r>
-        <w:t xml:space="preserve">  </w:t>
-      </w:r>
-      <w:r>
-        <w:rPr>
-          <w:color w:val="C00000"/>
-        </w:rPr>
-        <w:t>"muestras"</w:t>
-      </w:r>
-      <w:r>
-        <w:rPr>
-          <w:color w:val="002060"/>
-        </w:rPr>
-        <w:t>: [</w:t>
-      </w:r>
-    </w:p>
-    <w:p>
-      <w:pPr>
-        <w:spacing w:line="276" w:lineRule="auto"/>
-        <w:ind w:left="720"/>
-        <w:rPr>
-          <w:color w:val="002060"/>
-        </w:rPr>
-      </w:pPr>
-      <w:r>
-        <w:rPr>
-          <w:color w:val="002060"/>
-        </w:rPr>
-        <w:t xml:space="preserve">    </w:t>
-      </w:r>
-      <w:r>
-        <w:rPr>
-          <w:color w:val="C00000"/>
-        </w:rPr>
-        <w:t>"</w:t>
-      </w:r>
-      <w:proofErr w:type="spellStart"/>
-      <w:r>
-        <w:rPr>
-          <w:color w:val="C00000"/>
-        </w:rPr>
-        <w:t>strin</w:t>
-      </w:r>
-      <w:r>
-        <w:rPr>
-          <w:color w:val="C00000"/>
-        </w:rPr>
-        <w:t>g</w:t>
-      </w:r>
-      <w:proofErr w:type="spellEnd"/>
-      <w:r>
-        <w:rPr>
-          <w:color w:val="C00000"/>
-        </w:rPr>
-        <w:t>"</w:t>
-      </w:r>
-      <w:r>
-        <w:rPr>
-          <w:color w:val="C00000"/>
-        </w:rPr>
-        <w:t xml:space="preserve"> </w:t>
-      </w:r>
-      <w:r>
-        <w:rPr>
-          <w:color w:val="002060"/>
-        </w:rPr>
-        <w:sym w:font="Wingdings" w:char="F0E0"/>
-      </w:r>
-      <w:r>
-        <w:rPr>
-          <w:color w:val="002060"/>
-        </w:rPr>
-        <w:t xml:space="preserve"> </w:t>
-      </w:r>
-      <w:proofErr w:type="spellStart"/>
-      <w:r>
-        <w:rPr>
-          <w:color w:val="002060"/>
-        </w:rPr>
-        <w:t>Ej</w:t>
-      </w:r>
-      <w:proofErr w:type="spellEnd"/>
-      <w:r>
-        <w:rPr>
-          <w:color w:val="002060"/>
-        </w:rPr>
-        <w:t>: M02</w:t>
-      </w:r>
-    </w:p>
-    <w:p>
-      <w:pPr>
-        <w:spacing w:line="276" w:lineRule="auto"/>
-        <w:ind w:left="720"/>
-        <w:rPr>
-          <w:color w:val="002060"/>
-        </w:rPr>
-      </w:pPr>
-      <w:r>
-        <w:rPr>
-          <w:color w:val="002060"/>
-        </w:rPr>
-        <w:t xml:space="preserve">  ]</w:t>
-      </w:r>
-    </w:p>
-    <w:p>
-      <w:pPr>
-        <w:spacing w:line="276" w:lineRule="auto"/>
-        <w:ind w:left="720"/>
-        <w:rPr>
-          <w:color w:val="002060"/>
-        </w:rPr>
-      </w:pPr>
-      <w:r>
-        <w:rPr>
-          <w:color w:val="002060"/>
-        </w:rPr>
-        <w:t>}</w:t>
-      </w:r>
-      <w:r>
-        <w:rPr>
-          <w:color w:val="002060"/>
-        </w:rPr>
-        <w:br/>
-      </w:r>
+      </w:pPr>
     </w:p>
     <w:p>
       <w:pPr>
@@ -1407,9 +1113,7 @@
     </w:p>
     <w:p>
       <w:pPr>
-        <w:pStyle w:val="Compact"/>
-        <w:spacing w:after="0" w:line="276" w:lineRule="auto"/>
-        <w:ind w:left="720"/>
+        <w:pStyle w:val="Codigo"/>
       </w:pPr>
       <w:r>
         <w:t>{</w:t>
@@ -1417,459 +1121,105 @@
     </w:p>
     <w:p>
       <w:pPr>
-        <w:pStyle w:val="Compact"/>
-        <w:spacing w:after="0" w:line="276" w:lineRule="auto"/>
-        <w:ind w:left="720"/>
-        <w:rPr>
-          <w:lang w:val="es-MX"/>
-        </w:rPr>
-      </w:pPr>
-      <w:r>
-        <w:rPr>
-          <w:lang w:val="es-MX"/>
-        </w:rPr>
-        <w:t xml:space="preserve">  </w:t>
-      </w:r>
-      <w:r>
-        <w:rPr>
-          <w:color w:val="C00000"/>
-          <w:lang w:val="es-MX"/>
-        </w:rPr>
-        <w:t>"id"</w:t>
-      </w:r>
-      <w:r>
+        <w:pStyle w:val="Codigo"/>
+      </w:pPr>
+      <w:r>
+        <w:t xml:space="preserve">  "id": "string", </w:t>
+      </w:r>
+      <w:r>
+        <w:sym w:font="Wingdings" w:char="F0E0"/>
+      </w:r>
+      <w:r>
+        <w:t xml:space="preserve"> Id del nuevo expediente creado</w:t>
+      </w:r>
+    </w:p>
+    <w:p>
+      <w:pPr>
+        <w:pStyle w:val="Codigo"/>
+      </w:pPr>
+      <w:r>
+        <w:t xml:space="preserve">  "claveExpediente": "string", </w:t>
+      </w:r>
+      <w:r>
+        <w:sym w:font="Wingdings" w:char="F0E0"/>
+      </w:r>
+      <w:r>
+        <w:t xml:space="preserve"> La clave del expediente puede ser modificado</w:t>
+      </w:r>
+    </w:p>
+    <w:p>
+      <w:pPr>
+        <w:pStyle w:val="Codigo"/>
+      </w:pPr>
+      <w:r>
+        <w:t xml:space="preserve">  "ordenFabricacion": "string", </w:t>
+      </w:r>
+    </w:p>
+    <w:p>
+      <w:pPr>
+        <w:pStyle w:val="Codigo"/>
+      </w:pPr>
+      <w:r>
+        <w:t xml:space="preserve">  "cantidadMuestras": 0, </w:t>
+      </w:r>
+      <w:r>
+        <w:sym w:font="Wingdings" w:char="F0E0"/>
+      </w:r>
+      <w:r>
+        <w:t xml:space="preserve"> Puede actualizar este dato a su necesidad</w:t>
+      </w:r>
+    </w:p>
+    <w:p>
+      <w:pPr>
+        <w:pStyle w:val="Codigo"/>
+      </w:pPr>
+      <w:r>
+        <w:t xml:space="preserve">  "maximoRechazos": 0,</w:t>
+      </w:r>
+    </w:p>
+    <w:p>
+      <w:pPr>
+        <w:pStyle w:val="Codigo"/>
+      </w:pPr>
+      <w:r>
+        <w:t xml:space="preserve">  "muestras": [</w:t>
+      </w:r>
+    </w:p>
+    <w:p>
+      <w:pPr>
+        <w:pStyle w:val="Codigo"/>
+      </w:pPr>
+      <w:r>
+        <w:t xml:space="preserve">    "string" </w:t>
+      </w:r>
+      <w:r>
+        <w:sym w:font="Wingdings" w:char="F0E0"/>
+      </w:r>
+      <w:r>
+        <w:t xml:space="preserve"> Puede modificar este dato</w:t>
+      </w:r>
+    </w:p>
+    <w:p>
+      <w:pPr>
+        <w:pStyle w:val="Codigo"/>
+      </w:pPr>
+      <w:r>
+        <w:t xml:space="preserve">  ]</w:t>
+      </w:r>
+    </w:p>
+    <w:p>
+      <w:pPr>
+        <w:pStyle w:val="Codigo"/>
         <w:rPr>
           <w:color w:val="002060"/>
-          <w:lang w:val="es-MX"/>
-        </w:rPr>
-        <w:t>: "</w:t>
-      </w:r>
-      <w:proofErr w:type="spellStart"/>
+        </w:rPr>
+      </w:pPr>
+      <w:r>
+        <w:t>}</w:t>
+      </w:r>
       <w:r>
         <w:rPr>
           <w:color w:val="002060"/>
-          <w:lang w:val="es-MX"/>
-        </w:rPr>
-        <w:t>string</w:t>
-      </w:r>
-      <w:proofErr w:type="spellEnd"/>
-      <w:r>
-        <w:rPr>
-          <w:color w:val="002060"/>
-          <w:lang w:val="es-MX"/>
-        </w:rPr>
-        <w:t>",</w:t>
-      </w:r>
-      <w:r>
-        <w:rPr>
-          <w:color w:val="002060"/>
-          <w:lang w:val="es-MX"/>
-        </w:rPr>
-        <w:t xml:space="preserve"> </w:t>
-      </w:r>
-      <w:r>
-        <w:rPr>
-          <w:color w:val="002060"/>
-        </w:rPr>
-        <w:sym w:font="Wingdings" w:char="F0E0"/>
-      </w:r>
-      <w:r>
-        <w:rPr>
-          <w:color w:val="002060"/>
-          <w:lang w:val="es-MX"/>
-        </w:rPr>
-        <w:t xml:space="preserve"> Id del nuevo expediente creado</w:t>
-      </w:r>
-    </w:p>
-    <w:p>
-      <w:pPr>
-        <w:pStyle w:val="Compact"/>
-        <w:spacing w:after="0" w:line="276" w:lineRule="auto"/>
-        <w:ind w:left="720"/>
-        <w:rPr>
-          <w:lang w:val="es-MX"/>
-        </w:rPr>
-      </w:pPr>
-      <w:r>
-        <w:rPr>
-          <w:lang w:val="es-MX"/>
-        </w:rPr>
-        <w:t xml:space="preserve">  </w:t>
-      </w:r>
-      <w:r>
-        <w:rPr>
-          <w:color w:val="C00000"/>
-          <w:lang w:val="es-MX"/>
-        </w:rPr>
-        <w:t>"</w:t>
-      </w:r>
-      <w:proofErr w:type="spellStart"/>
-      <w:r>
-        <w:rPr>
-          <w:color w:val="C00000"/>
-          <w:lang w:val="es-MX"/>
-        </w:rPr>
-        <w:t>claveExpediente</w:t>
-      </w:r>
-      <w:proofErr w:type="spellEnd"/>
-      <w:r>
-        <w:rPr>
-          <w:color w:val="C00000"/>
-          <w:lang w:val="es-MX"/>
-        </w:rPr>
-        <w:t>"</w:t>
-      </w:r>
-      <w:r>
-        <w:rPr>
-          <w:color w:val="002060"/>
-          <w:lang w:val="es-MX"/>
-        </w:rPr>
-        <w:t>: "</w:t>
-      </w:r>
-      <w:proofErr w:type="spellStart"/>
-      <w:r>
-        <w:rPr>
-          <w:color w:val="002060"/>
-          <w:lang w:val="es-MX"/>
-        </w:rPr>
-        <w:t>string</w:t>
-      </w:r>
-      <w:proofErr w:type="spellEnd"/>
-      <w:r>
-        <w:rPr>
-          <w:color w:val="002060"/>
-          <w:lang w:val="es-MX"/>
-        </w:rPr>
-        <w:t>",</w:t>
-      </w:r>
-      <w:r>
-        <w:rPr>
-          <w:color w:val="002060"/>
-          <w:lang w:val="es-MX"/>
-        </w:rPr>
-        <w:t xml:space="preserve"> </w:t>
-      </w:r>
-      <w:r>
-        <w:rPr>
-          <w:color w:val="002060"/>
-          <w:lang w:val="es-MX"/>
-        </w:rPr>
-        <w:sym w:font="Wingdings" w:char="F0E0"/>
-      </w:r>
-      <w:r>
-        <w:rPr>
-          <w:color w:val="002060"/>
-          <w:lang w:val="es-MX"/>
-        </w:rPr>
-        <w:t xml:space="preserve"> La clave del expediente puede ser modificado</w:t>
-      </w:r>
-    </w:p>
-    <w:p>
-      <w:pPr>
-        <w:pStyle w:val="Compact"/>
-        <w:spacing w:after="0" w:line="276" w:lineRule="auto"/>
-        <w:ind w:left="720"/>
-        <w:rPr>
-          <w:lang w:val="es-MX"/>
-        </w:rPr>
-      </w:pPr>
-      <w:r>
-        <w:rPr>
-          <w:lang w:val="es-MX"/>
-        </w:rPr>
-        <w:t xml:space="preserve">  </w:t>
-      </w:r>
-      <w:r>
-        <w:rPr>
-          <w:color w:val="C00000"/>
-          <w:lang w:val="es-MX"/>
-        </w:rPr>
-        <w:t>"</w:t>
-      </w:r>
-      <w:proofErr w:type="spellStart"/>
-      <w:r>
-        <w:rPr>
-          <w:color w:val="C00000"/>
-          <w:lang w:val="es-MX"/>
-        </w:rPr>
-        <w:t>ordenFabricacion</w:t>
-      </w:r>
-      <w:proofErr w:type="spellEnd"/>
-      <w:r>
-        <w:rPr>
-          <w:color w:val="C00000"/>
-          <w:lang w:val="es-MX"/>
-        </w:rPr>
-        <w:t>"</w:t>
-      </w:r>
-      <w:r>
-        <w:rPr>
-          <w:color w:val="002060"/>
-          <w:lang w:val="es-MX"/>
-        </w:rPr>
-        <w:t>: "</w:t>
-      </w:r>
-      <w:proofErr w:type="spellStart"/>
-      <w:r>
-        <w:rPr>
-          <w:color w:val="002060"/>
-          <w:lang w:val="es-MX"/>
-        </w:rPr>
-        <w:t>string</w:t>
-      </w:r>
-      <w:proofErr w:type="spellEnd"/>
-      <w:r>
-        <w:rPr>
-          <w:color w:val="002060"/>
-          <w:lang w:val="es-MX"/>
-        </w:rPr>
-        <w:t>",</w:t>
-      </w:r>
-      <w:r>
-        <w:rPr>
-          <w:lang w:val="es-MX"/>
-        </w:rPr>
-        <w:t xml:space="preserve"> </w:t>
-      </w:r>
-    </w:p>
-    <w:p>
-      <w:pPr>
-        <w:pStyle w:val="Compact"/>
-        <w:spacing w:after="0" w:line="276" w:lineRule="auto"/>
-        <w:ind w:left="720"/>
-        <w:rPr>
-          <w:lang w:val="es-MX"/>
-        </w:rPr>
-      </w:pPr>
-      <w:r>
-        <w:rPr>
-          <w:lang w:val="es-MX"/>
-        </w:rPr>
-        <w:t xml:space="preserve">  </w:t>
-      </w:r>
-      <w:r>
-        <w:rPr>
-          <w:color w:val="C00000"/>
-          <w:lang w:val="es-MX"/>
-        </w:rPr>
-        <w:t>"</w:t>
-      </w:r>
-      <w:proofErr w:type="spellStart"/>
-      <w:r>
-        <w:rPr>
-          <w:color w:val="C00000"/>
-          <w:lang w:val="es-MX"/>
-        </w:rPr>
-        <w:t>cantidadMuestras</w:t>
-      </w:r>
-      <w:proofErr w:type="spellEnd"/>
-      <w:r>
-        <w:rPr>
-          <w:color w:val="C00000"/>
-          <w:lang w:val="es-MX"/>
-        </w:rPr>
-        <w:t>"</w:t>
-      </w:r>
-      <w:r>
-        <w:rPr>
-          <w:color w:val="002060"/>
-          <w:lang w:val="es-MX"/>
-        </w:rPr>
-        <w:t>: 0,</w:t>
-      </w:r>
-      <w:r>
-        <w:rPr>
-          <w:color w:val="002060"/>
-          <w:lang w:val="es-MX"/>
-        </w:rPr>
-        <w:t xml:space="preserve"> </w:t>
-      </w:r>
-      <w:r>
-        <w:rPr>
-          <w:color w:val="002060"/>
-          <w:lang w:val="es-MX"/>
-        </w:rPr>
-        <w:sym w:font="Wingdings" w:char="F0E0"/>
-      </w:r>
-      <w:r>
-        <w:rPr>
-          <w:color w:val="002060"/>
-          <w:lang w:val="es-MX"/>
-        </w:rPr>
-        <w:t xml:space="preserve"> Puede actualizar este dato a su necesidad</w:t>
-      </w:r>
-    </w:p>
-    <w:p>
-      <w:pPr>
-        <w:pStyle w:val="Compact"/>
-        <w:spacing w:after="0" w:line="276" w:lineRule="auto"/>
-        <w:ind w:left="720"/>
-        <w:rPr>
-          <w:lang w:val="es-MX"/>
-        </w:rPr>
-      </w:pPr>
-      <w:r>
-        <w:rPr>
-          <w:lang w:val="es-MX"/>
-        </w:rPr>
-        <w:t xml:space="preserve">  </w:t>
-      </w:r>
-      <w:r>
-        <w:rPr>
-          <w:color w:val="C00000"/>
-          <w:lang w:val="es-MX"/>
-        </w:rPr>
-        <w:t>"</w:t>
-      </w:r>
-      <w:proofErr w:type="spellStart"/>
-      <w:r>
-        <w:rPr>
-          <w:color w:val="C00000"/>
-          <w:lang w:val="es-MX"/>
-        </w:rPr>
-        <w:t>maximoRechazos</w:t>
-      </w:r>
-      <w:proofErr w:type="spellEnd"/>
-      <w:r>
-        <w:rPr>
-          <w:color w:val="C00000"/>
-          <w:lang w:val="es-MX"/>
-        </w:rPr>
-        <w:t>"</w:t>
-      </w:r>
-      <w:r>
-        <w:rPr>
-          <w:color w:val="002060"/>
-          <w:lang w:val="es-MX"/>
-        </w:rPr>
-        <w:t>: 0,</w:t>
-      </w:r>
-    </w:p>
-    <w:p>
-      <w:pPr>
-        <w:pStyle w:val="Compact"/>
-        <w:spacing w:after="0" w:line="276" w:lineRule="auto"/>
-        <w:ind w:left="720"/>
-        <w:rPr>
-          <w:color w:val="002060"/>
-          <w:lang w:val="es-MX"/>
-        </w:rPr>
-      </w:pPr>
-      <w:r>
-        <w:rPr>
-          <w:lang w:val="es-MX"/>
-        </w:rPr>
-        <w:t xml:space="preserve">  </w:t>
-      </w:r>
-      <w:r>
-        <w:rPr>
-          <w:color w:val="C00000"/>
-          <w:lang w:val="es-MX"/>
-        </w:rPr>
-        <w:t>"muestras"</w:t>
-      </w:r>
-      <w:r>
-        <w:rPr>
-          <w:color w:val="002060"/>
-          <w:lang w:val="es-MX"/>
-        </w:rPr>
-        <w:t>: [</w:t>
-      </w:r>
-    </w:p>
-    <w:p>
-      <w:pPr>
-        <w:pStyle w:val="Compact"/>
-        <w:spacing w:after="0" w:line="276" w:lineRule="auto"/>
-        <w:ind w:left="720"/>
-        <w:rPr>
-          <w:color w:val="002060"/>
-          <w:lang w:val="es-MX"/>
-        </w:rPr>
-      </w:pPr>
-      <w:r>
-        <w:rPr>
-          <w:color w:val="002060"/>
-          <w:lang w:val="es-MX"/>
-        </w:rPr>
-        <w:t xml:space="preserve">    "</w:t>
-      </w:r>
-      <w:proofErr w:type="spellStart"/>
-      <w:r>
-        <w:rPr>
-          <w:color w:val="002060"/>
-          <w:lang w:val="es-MX"/>
-        </w:rPr>
-        <w:t>string</w:t>
-      </w:r>
-      <w:proofErr w:type="spellEnd"/>
-      <w:r>
-        <w:rPr>
-          <w:color w:val="002060"/>
-          <w:lang w:val="es-MX"/>
-        </w:rPr>
-        <w:t>"</w:t>
-      </w:r>
-      <w:r>
-        <w:rPr>
-          <w:color w:val="002060"/>
-          <w:lang w:val="es-MX"/>
-        </w:rPr>
-        <w:t xml:space="preserve"> </w:t>
-      </w:r>
-      <w:r>
-        <w:rPr>
-          <w:color w:val="002060"/>
-          <w:lang w:val="es-MX"/>
-        </w:rPr>
-        <w:sym w:font="Wingdings" w:char="F0E0"/>
-      </w:r>
-      <w:r>
-        <w:rPr>
-          <w:color w:val="002060"/>
-          <w:lang w:val="es-MX"/>
-        </w:rPr>
-        <w:t xml:space="preserve"> Puede modificar este dato</w:t>
-      </w:r>
-    </w:p>
-    <w:p>
-      <w:pPr>
-        <w:pStyle w:val="Compact"/>
-        <w:spacing w:after="0" w:line="276" w:lineRule="auto"/>
-        <w:ind w:left="720"/>
-        <w:rPr>
-          <w:color w:val="002060"/>
-          <w:lang w:val="es-MX"/>
-        </w:rPr>
-      </w:pPr>
-      <w:r>
-        <w:rPr>
-          <w:color w:val="002060"/>
-          <w:lang w:val="es-MX"/>
-        </w:rPr>
-        <w:t xml:space="preserve">  ]</w:t>
-      </w:r>
-    </w:p>
-    <w:p>
-      <w:pPr>
-        <w:pStyle w:val="Compact"/>
-        <w:spacing w:after="0" w:line="276" w:lineRule="auto"/>
-        <w:ind w:left="720"/>
-        <w:rPr>
-          <w:color w:val="002060"/>
-          <w:lang w:val="es-MX"/>
-        </w:rPr>
-      </w:pPr>
-      <w:r>
-        <w:rPr>
-          <w:color w:val="002060"/>
-          <w:lang w:val="es-MX"/>
-        </w:rPr>
-        <w:t>}</w:t>
-      </w:r>
-      <w:r>
-        <w:rPr>
-          <w:color w:val="002060"/>
-          <w:lang w:val="es-MX"/>
         </w:rPr>
         <w:br/>
       </w:r>
@@ -2024,7 +1374,7 @@
       <w:bookmarkEnd w:id="7"/>
       <w:r>
         <w:pict w14:anchorId="73E6C941">
-          <v:rect id="_x0000_i1031" style="width:0;height:1.5pt" o:hralign="center" o:hrstd="t" o:hr="t"/>
+          <v:rect id="_x0000_i1029" style="width:0;height:1.5pt" o:hralign="center" o:hrstd="t" o:hr="t"/>
         </w:pict>
       </w:r>
     </w:p>
@@ -2048,7 +1398,6 @@
           <w:sz w:val="28"/>
           <w:szCs w:val="28"/>
         </w:rPr>
-        <w:lastRenderedPageBreak/>
         <w:t>5. Resultados esperados</w:t>
       </w:r>
     </w:p>
@@ -2115,6 +1464,7 @@
         <w:rPr>
           <w:lang w:val="es-MX"/>
         </w:rPr>
+        <w:lastRenderedPageBreak/>
         <w:t>La prueba queda asignada al expediente.</w:t>
       </w:r>
       <w:r>
@@ -2607,7 +1957,7 @@
 <w:numbering xmlns:wpc="http://schemas.microsoft.com/office/word/2010/wordprocessingCanvas" xmlns:cx="http://schemas.microsoft.com/office/drawing/2014/chartex" xmlns:cx1="http://schemas.microsoft.com/office/drawing/2015/9/8/chartex" xmlns:cx2="http://schemas.microsoft.com/office/drawing/2015/10/21/chartex" xmlns:cx3="http://schemas.microsoft.com/office/drawing/2016/5/9/chartex" xmlns:cx4="http://schemas.microsoft.com/office/drawing/2016/5/10/chartex" xmlns:cx5="http://schemas.microsoft.com/office/drawing/2016/5/11/chartex" xmlns:cx6="http://schemas.microsoft.com/office/drawing/2016/5/12/chartex" xmlns:cx7="http://schemas.microsoft.com/office/drawing/2016/5/13/chartex" xmlns:cx8="http://schemas.microsoft.com/office/drawing/2016/5/14/chartex" xmlns:mc="http://schemas.openxmlformats.org/markup-compatibility/2006" xmlns:aink="http://schemas.microsoft.com/office/drawing/2016/ink" xmlns:am3d="http://schemas.microsoft.com/office/drawing/2017/model3d" xmlns:o="urn:schemas-microsoft-com:office:office" xmlns:oel="http://schemas.microsoft.com/office/2019/extlst" xmlns:r="http://schemas.openxmlformats.org/officeDocument/2006/relationships" xmlns:m="http://schemas.openxmlformats.org/officeDocument/2006/math" xmlns:v="urn:schemas-microsoft-com:vml" xmlns:wp14="http://schemas.microsoft.com/office/word/2010/wordprocessingDrawing" xmlns:wp="http://schemas.openxmlformats.org/drawingml/2006/wordprocessingDrawing" xmlns:w10="urn:schemas-microsoft-com:office:word" xmlns:w="http://schemas.openxmlformats.org/wordprocessingml/2006/main" xmlns:w14="http://schemas.microsoft.com/office/word/2010/wordml" xmlns:w15="http://schemas.microsoft.com/office/word/2012/wordml" xmlns:w16cex="http://schemas.microsoft.com/office/word/2018/wordml/cex" xmlns:w16cid="http://schemas.microsoft.com/office/word/2016/wordml/cid" xmlns:w16="http://schemas.microsoft.com/office/word/2018/wordml" xmlns:w16du="http://schemas.microsoft.com/office/word/2023/wordml/word16du" xmlns:w16sdtdh="http://schemas.microsoft.com/office/word/2020/wordml/sdtdatahash" xmlns:w16sdtfl="http://schemas.microsoft.com/office/word/2024/wordml/sdtformatlock" xmlns:w16se="http://schemas.microsoft.com/office/word/2015/wordml/symex" xmlns:wpg="http://schemas.microsoft.com/office/word/2010/wordprocessingGroup" xmlns:wpi="http://schemas.microsoft.com/office/word/2010/wordprocessingInk" xmlns:wne="http://schemas.microsoft.com/office/word/2006/wordml" xmlns:wps="http://schemas.microsoft.com/office/word/2010/wordprocessingShape" mc:Ignorable="w14 w15 w16se w16cid w16 w16cex w16sdtdh w16sdtfl w16du wp14">
   <w:numPicBullet w:numPicBulletId="0">
     <w:pict>
-      <v:rect id="_x0000_i1074" style="width:0;height:1.5pt" o:hralign="center" o:bullet="t" o:hrstd="t" o:hr="t"/>
+      <v:rect id="_x0000_i1055" style="width:0;height:1.5pt" o:hralign="center" o:bullet="t" o:hrstd="t" o:hr="t"/>
     </w:pict>
   </w:numPicBullet>
   <w:abstractNum w:abstractNumId="0" w15:restartNumberingAfterBreak="0">
@@ -3988,7 +3338,6 @@
   <w:style w:type="character" w:default="1" w:styleId="Fuentedeprrafopredeter">
     <w:name w:val="Default Paragraph Font"/>
     <w:uiPriority w:val="1"/>
-    <w:semiHidden/>
     <w:unhideWhenUsed/>
   </w:style>
   <w:style w:type="table" w:default="1" w:styleId="Tablanormal">
@@ -4516,6 +3865,21 @@
     <w:uiPriority w:val="99"/>
     <w:semiHidden/>
     <w:rsid w:val="00F74FF0"/>
+  </w:style>
+  <w:style w:type="paragraph" w:customStyle="1" w:styleId="Codigo">
+    <w:name w:val="Codigo"/>
+    <w:basedOn w:val="Normal"/>
+    <w:qFormat/>
+    <w:rsid w:val="002A197D"/>
+    <w:pPr>
+      <w:shd w:val="clear" w:color="auto" w:fill="E8E8E8" w:themeFill="background2"/>
+      <w:ind w:left="708"/>
+    </w:pPr>
+    <w:rPr>
+      <w:rFonts w:ascii="Courier New" w:hAnsi="Courier New"/>
+      <w:noProof/>
+      <w:sz w:val="20"/>
+    </w:rPr>
   </w:style>
 </w:styles>
 </file>

</xml_diff>